<commit_message>
UI ve YouTube gelistirmeleri:
1. 6 Brans Gelisim Receteleri bolumune dogrudan acik 6'li YouTube Ders Vitrini eklendi; expander'lar varsayilan acik (expanded=True) yapildi ve basliklarina kanal adlari eklendi.
2. Turkce ve Fen derslerindeki kanal ve yonlendirme metinleri netlestirildi ('Hiz Yayinlari veya Ebubekir Hoca ile Turkce Dinle' vb.).
3. Sidebar cikis butonu belirgin kirmizi buton stiliyle (.logout-btn-box) guclendirildi.
4. Giris ekranlarinda sifre/PIN yazildiktan sonra klavyeden Enter'a basildiginda aninda giris yapilmasi icin st.form ve st.form_submit_button entegrasyonu tamamlandi.
5. 27 karne ve tum karneler ZIP paketi guncellendi.
</commit_message>
<xml_diff>
--- a/exports/karneler/182_ERDEM_YARAR_Karne.docx
+++ b/exports/karneler/182_ERDEM_YARAR_Karne.docx
@@ -1749,7 +1749,7 @@
                 <w:b/>
                 <w:sz w:val="15"/>
               </w:rPr>
-              <w:t xml:space="preserve">Kanal: Hız Yayınları / dnz hoca | </w:t>
+              <w:t xml:space="preserve">Kanal: Hız Yayınları veya dnz hoca ile Fen | </w:t>
             </w:r>
             <w:r>
               <w:rPr>
@@ -2076,7 +2076,7 @@
                 <w:b/>
                 <w:sz w:val="15"/>
               </w:rPr>
-              <w:t xml:space="preserve">Kanal: Hız Yayınları - Ebubekir Hoca | </w:t>
+              <w:t xml:space="preserve">Kanal: Hız Yayınları veya Ebubekir Hoca ile Türkçe | </w:t>
             </w:r>
             <w:r>
               <w:rPr>

</xml_diff>